<commit_message>
feat(risk): harden fault-confirmed risk grading, per-account limits, and guest listing UX
</commit_message>
<xml_diff>
--- a/BAO_CAO_KIEN_TRUC_VAN_HANH_CLOOP.docx
+++ b/BAO_CAO_KIEN_TRUC_VAN_HANH_CLOOP.docx
@@ -88,7 +88,7 @@
                 <w:color w:val="0F4A34"/>
                 <w:sz w:val="24"/>
               </w:rPr>
-              <w:t xml:space="preserve">CAM KẾT CHẤT LƯỢNG SẢN PHẨM SỐ: </w:t>
+              <w:t xml:space="preserve">CAM KẾT CHẤT LƯỢNG SẢN PHẨM SỐ &amp; TUYÊN BỐ NGUỒN VỐN BẢO CHỨNG: </w:t>
             </w:r>
             <w:r>
               <w:rPr>
@@ -96,7 +96,7 @@
                 <w:i/>
                 <w:sz w:val="23"/>
               </w:rPr>
-              <w:t>Bản báo cáo v5.1 tích hợp toàn bộ các kết quả kiểm định mã nguồn thực tế tại commit mới nhất trên nhánh chính (origin/main). Hệ thống đạt 0 lỗi TypeScript (npx tsc --noEmit), 0 lỗi ESLint, vượt qua 45/45 bài kiểm thử tự động (31 Unit Tests + 14 Integration Tests), bãi bỏ hoàn toàn các giả định phi thực tế về miễn cọc 0 đồng và xóa bỏ triệt để các biểu tượng trang trí lấp lánh để chuyển hóa 100% giao diện sang chuẩn mực số hóa cao cấp của Fintech/E-Commerce.</w:t>
+              <w:t>Bản báo cáo v5.2 tích hợp toàn bộ các kết quả kiểm định mã nguồn thực tế tại commit mới nhất trên nhánh chính (origin/main). Hệ thống đạt 0 lỗi TypeScript (npx tsc --noEmit), 0 lỗi ESLint, vượt qua 57/57 bài kiểm thử tự động (43 Unit Tests + 14 Integration Tests). NGUYÊN TẮC VÀNG BẢO TOÀN NGUỒN VỐN: 'CLOOP không cam kết bảo lãnh vô hạn. Quyền giảm cọc chỉ được kích hoạt trong phạm vi quỹ dự phòng khả dụng, hạn mức bảo lãnh từng đơn, hạn mức rủi ro từng tài khoản và hạn mức chi trả theo tháng. Khi một trong các giới hạn bị chạm, hệ thống tự động quay về mức cọc 100%.' Đồng thời, bãi bỏ hoàn toàn các giả định phi thực tế về miễn cọc 0 đồng và xóa bỏ triệt để các biểu tượng trang trí lấp lánh để chuyển hóa 100% giao diện sang chuẩn mực số hóa cao cấp của Fintech/E-Commerce.</w:t>
             </w:r>
           </w:p>
         </w:tc>
@@ -3975,8 +3975,66 @@
           <w:rFonts w:ascii="Times New Roman" w:hAnsi="Times New Roman"/>
           <w:sz w:val="25"/>
         </w:rPr>
-        <w:t>Thay vì áp dụng cơ chế eKYC nặng nề chặn cửa hoặc cấp ưu đãi giảm cọc vô điều kiện dẫn đến nguy cơ vỡ quỹ, CLOOP phát triển mô hình 'Hợp Đồng Bảo Lãnh Cọc Giới Hạn Năng Lực Quỹ' (Fund-Capacity Constrained Guarantee). Mọi quyền lợi giảm cọc đều được quản trị bởi điều kiện đa yếu tố, bảo chứng bằng số dư Quỹ dự phòng rủi ro khả dụng thực tế, giới hạn trần bảo lãnh trên từng đơn và có cơ chế ngắt mạch Circuit Breaker tự động:</w:t>
+        <w:t>Thay vì áp dụng cơ chế eKYC nặng nề chặn cửa hoặc cấp ưu đãi giảm cọc vô điều kiện dẫn đến nguy cơ vỡ quỹ, CLOOP phát triển mô hình 'Hợp Đồng Bảo Lãnh Cọc Giới Hạn Năng Lực Quỹ' (Fund-Capacity Constrained Guarantee). Mọi quyền lợi giảm cọc đều được quản trị bởi điều kiện đa yếu tố, bảo chứng bằng số dư Quỹ dự phòng rủi ro khả dụng thực tế, hạn mức bảo lãnh từng đơn, hạn mức rủi ro từng tài khoản và có cơ chế ngắt mạch Circuit Breaker tự động.</w:t>
       </w:r>
+    </w:p>
+    <w:tbl>
+      <w:tblPr>
+        <w:tblW w:type="auto" w:w="0"/>
+        <w:jc w:val="center"/>
+        <w:tblLook w:firstColumn="1" w:firstRow="1" w:lastColumn="0" w:lastRow="0" w:noHBand="0" w:noVBand="1" w:val="04A0"/>
+      </w:tblPr>
+      <w:tblGrid>
+        <w:gridCol w:w="9071"/>
+      </w:tblGrid>
+      <w:tr>
+        <w:tc>
+          <w:tcPr>
+            <w:tcW w:type="dxa" w:w="9071"/>
+            <w:shd w:fill="F4F9F4"/>
+            <w:tcMar>
+              <w:top w:w="140" w:type="dxa"/>
+              <w:bottom w:w="140" w:type="dxa"/>
+              <w:left w:w="180" w:type="dxa"/>
+              <w:right w:w="160" w:type="dxa"/>
+            </w:tcMar>
+            <w:tcBorders>
+              <w:top w:val="none"/>
+              <w:bottom w:val="none"/>
+              <w:left w:val="single" w:sz="24" w:space="0" w:color="0F4A34"/>
+              <w:right w:val="none"/>
+            </w:tcBorders>
+          </w:tcPr>
+          <w:p>
+            <w:pPr>
+              <w:spacing w:after="40"/>
+              <w:jc w:val="both"/>
+            </w:pPr>
+            <w:r>
+              <w:rPr>
+                <w:rFonts w:ascii="Times New Roman" w:hAnsi="Times New Roman"/>
+                <w:b/>
+                <w:color w:val="0F4A34"/>
+                <w:sz w:val="24"/>
+              </w:rPr>
+              <w:t xml:space="preserve">TUYÊN BỐ NGUYÊN TẮC VÀNG BẢO TOÀN NGUỒN VỐN SÀN: </w:t>
+            </w:r>
+            <w:r>
+              <w:rPr>
+                <w:rFonts w:ascii="Times New Roman" w:hAnsi="Times New Roman"/>
+                <w:i/>
+                <w:sz w:val="23"/>
+              </w:rPr>
+              <w:t>CLOOP không cam kết bảo lãnh vô hạn. Quyền giảm cọc chỉ được kích hoạt trong phạm vi quỹ dự phòng khả dụng, hạn mức bảo lãnh từng đơn, hạn mức rủi ro từng tài khoản và hạn mức chi trả theo tháng. Khi một trong các giới hạn bị chạm, hệ thống tự động quay về mức cọc 100%.</w:t>
+            </w:r>
+          </w:p>
+        </w:tc>
+      </w:tr>
+    </w:tbl>
+    <w:p>
+      <w:pPr>
+        <w:spacing w:before="40" w:after="40"/>
+      </w:pPr>
     </w:p>
     <w:tbl>
       <w:tblPr>
@@ -4074,7 +4132,7 @@
                 <w:color w:val="0A2517"/>
                 <w:sz w:val="22"/>
               </w:rPr>
-              <w:t>Ngưỡng Quỹ Bảo Chứng</w:t>
+              <w:t>Ngưỡng Quỹ Khả Dụng</w:t>
             </w:r>
           </w:p>
         </w:tc>
@@ -4126,7 +4184,7 @@
                 <w:color w:val="0A2517"/>
                 <w:sz w:val="22"/>
               </w:rPr>
-              <w:t>Chính Sách Cọc &amp; Bảo Lãnh</w:t>
+              <w:t>Chính Sách Cọc &amp; Hạn Mức Bảo Lãnh</w:t>
             </w:r>
           </w:p>
         </w:tc>
@@ -4254,7 +4312,9 @@
               </w:rPr>
               <w:t>Cọc 100% giá trị niêm yết</w:t>
               <w:br/>
-              <w:t>(Không chiết khấu cọc)</w:t>
+              <w:t>(Không bảo lãnh / không chiết khấu cọc)</w:t>
+              <w:br/>
+              <w:t>Trần bảo lãnh tài khoản: 0đ</w:t>
             </w:r>
           </w:p>
         </w:tc>
@@ -4314,9 +4374,9 @@
               <w:br/>
               <w:t>≥ 2 chủ đồ khác nhau</w:t>
               <w:br/>
-              <w:t>≥ 14 ngày từ đơn đầu</w:t>
+              <w:t>≥ 14 ngày quan sát tín nhiệm</w:t>
               <w:br/>
-              <w:t>0 tranh chấp/hủy</w:t>
+              <w:t>0 vi phạm xác định lỗi</w:t>
             </w:r>
           </w:p>
         </w:tc>
@@ -4340,7 +4400,7 @@
                 <w:rFonts w:ascii="Times New Roman" w:hAnsi="Times New Roman"/>
                 <w:sz w:val="20"/>
               </w:rPr>
-              <w:t>Quỹ rủi ro ≥ 5.000.000đ</w:t>
+              <w:t>Quỹ khả dụng ≥ 5.000.000đ</w:t>
               <w:br/>
               <w:t>(Dưới 5tr: cọc 100% toàn sàn)</w:t>
             </w:r>
@@ -4395,6 +4455,10 @@
               <w:t>Bảo lãnh giảm 10% cọc (trả 90%)</w:t>
               <w:br/>
               <w:t>Trần bảo lãnh tối đa: 200.000đ/đơn</w:t>
+              <w:br/>
+              <w:t>Trần bảo lãnh tài khoản: 500.000đ</w:t>
+              <w:br/>
+              <w:t>Tối đa 2 đơn giảm cọc đồng thời</w:t>
             </w:r>
           </w:p>
         </w:tc>
@@ -4454,7 +4518,9 @@
               <w:br/>
               <w:t>≥ 3 chủ đồ khác nhau</w:t>
               <w:br/>
-              <w:t>0 tranh chấp/hủy</w:t>
+              <w:t>≥ 14 ngày quan sát tín nhiệm</w:t>
+              <w:br/>
+              <w:t>0 vi phạm xác định lỗi</w:t>
             </w:r>
           </w:p>
         </w:tc>
@@ -4478,7 +4544,7 @@
                 <w:rFonts w:ascii="Times New Roman" w:hAnsi="Times New Roman"/>
                 <w:sz w:val="20"/>
               </w:rPr>
-              <w:t>Quỹ rủi ro ≥ 15.000.000đ</w:t>
+              <w:t>Quỹ khả dụng ≥ 15.000.000đ</w:t>
               <w:br/>
               <w:t>(Dưới 15tr: hạ về Level 1)</w:t>
             </w:r>
@@ -4533,6 +4599,10 @@
               <w:t>Bảo lãnh giảm 20% cọc (trả 80%)</w:t>
               <w:br/>
               <w:t>Trần bảo lãnh tối đa: 500.000đ/đơn</w:t>
+              <w:br/>
+              <w:t>Trần bảo lãnh tài khoản: 1.500.000đ</w:t>
+              <w:br/>
+              <w:t>Tối đa 4 đơn giảm cọc đồng thời</w:t>
             </w:r>
           </w:p>
         </w:tc>
@@ -4592,7 +4662,9 @@
               <w:br/>
               <w:t>≥ 5 chủ đồ khác nhau</w:t>
               <w:br/>
-              <w:t>0 tranh chấp/hủy</w:t>
+              <w:t>≥ 14 ngày quan sát tín nhiệm</w:t>
+              <w:br/>
+              <w:t>0 vi phạm xác định lỗi</w:t>
             </w:r>
           </w:p>
         </w:tc>
@@ -4616,7 +4688,7 @@
                 <w:rFonts w:ascii="Times New Roman" w:hAnsi="Times New Roman"/>
                 <w:sz w:val="20"/>
               </w:rPr>
-              <w:t>Quỹ rủi ro ≥ 30.000.000đ</w:t>
+              <w:t>Quỹ khả dụng ≥ 30.000.000đ</w:t>
               <w:br/>
               <w:t>(Dưới 30tr: hạ về Level 2)</w:t>
             </w:r>
@@ -4672,6 +4744,10 @@
               <w:br/>
               <w:t>Trần bảo lãnh tối đa: 1.000.000đ/đơn</w:t>
               <w:br/>
+              <w:t>Trần bảo lãnh tài khoản: 3.000.000đ</w:t>
+              <w:br/>
+              <w:t>Tối đa 6 đơn giảm cọc đồng thời</w:t>
+              <w:br/>
               <w:t>(TUYỆT ĐỐI KHÔNG CỌC 0 ĐỒNG)</w:t>
             </w:r>
           </w:p>
@@ -4690,7 +4766,7 @@
           <w:color w:val="183A2D"/>
           <w:sz w:val="26"/>
         </w:rPr>
-        <w:t>1. Chi Tiết 4 Lớp Phòng Tuyến Fast-Track (Server-Enforced Defenses)</w:t>
+        <w:t>1. Phân Tách Lỗi Đã Xác Định (Fault-Confirmed) vs Hủy Đơn Hợp Lệ</w:t>
       </w:r>
     </w:p>
     <w:p>
@@ -4703,7 +4779,7 @@
           <w:rFonts w:ascii="Times New Roman" w:hAnsi="Times New Roman"/>
           <w:sz w:val="25"/>
         </w:rPr>
-        <w:t>Để ngăn ngừa triệt để các cuộc tấn công chiếm đoạt tài sản có tổ chức (nơi kẻ xấu tạo tài khoản nặc danh để quét đồ giá trị cao), CLOOP thiết lập 4 lớp kiểm soát tuần tự phía máy chủ:</w:t>
+        <w:t>Hệ thống phân biệt rạch ròi hành vi vi phạm có lỗi với việc hủy đơn vì lý do khách quan nhằm không phạt nhầm khách hàng trung thực:</w:t>
       </w:r>
     </w:p>
     <w:p>
@@ -4718,14 +4794,14 @@
           <w:b/>
           <w:sz w:val="25"/>
         </w:rPr>
-        <w:t xml:space="preserve">Lớp 0 (Defense 0 - KYC / Student Proof Check): </w:t>
+        <w:t xml:space="preserve">• Lỗi Vi Phạm Xác Định (Phạt Hạ Level 0): </w:t>
       </w:r>
       <w:r>
         <w:rPr>
           <w:rFonts w:ascii="Times New Roman" w:hAnsi="Times New Roman"/>
           <w:sz w:val="25"/>
         </w:rPr>
-        <w:t>Tài khoản mới Level 0 (LEVEL_0_NEW) chưa định danh (isVerified = false) BỊ CHẶN TUYỆT ĐỐI không được phép kích hoạt chế độ Fast-Track. Người dùng bắt buộc phải hoàn tất xác minh Email trường (@edu.vn) hoặc định danh CCCD cơ bản trước khi được quyền nộp cọc 100% để vượt trần.</w:t>
+        <w:t>Chỉ khi người thuê có hành vi gian lận bùng đồ, phá hỏng trang phục nghiêm trọng đã có quyết định xử lý bồi thường (fraudConfirmedDisputeCount &gt; 0), trả đồ trễ hạn nghiêm trọng quá 2 ngày không báo trước (seriousLateReturnCount &gt; 0), hoặc hủy đơn cố ý / spam đơn ảo (intentionalCancellationCount &gt; 0).</w:t>
       </w:r>
     </w:p>
     <w:p>
@@ -4740,14 +4816,14 @@
           <w:b/>
           <w:sz w:val="25"/>
         </w:rPr>
-        <w:t xml:space="preserve">Lớp 1 (Defense 1 - Active Dispute Gate): </w:t>
+        <w:t xml:space="preserve">• Tranh Chấp Đang Mở (Tạm Đóng Băng Quyền Lợi): </w:t>
       </w:r>
       <w:r>
         <w:rPr>
           <w:rFonts w:ascii="Times New Roman" w:hAnsi="Times New Roman"/>
           <w:sz w:val="25"/>
         </w:rPr>
-        <w:t>Hệ thống kiểm tra lịch sử tài khoản theo thời gian thực. Nếu người dùng đang có bất kỳ hồ sơ khiếu nại tranh chấp nào đang mở (Pending / Under Investigation), tính năng Fast-Track lập tức bị khóa để cách ly rủi ro.</w:t>
+        <w:t>Khi tài khoản đang có khiếu nại chưa xử lý (openDisputeCount &gt; 0), hệ thống tạm thời khóa quyền giảm cọc trong thời gian thụ lý thẩm định; KHÔNG đánh tụt Level 0 vĩnh viễn và KHÔNG xóa điểm uy tín của khách.</w:t>
       </w:r>
     </w:p>
     <w:p>
@@ -4762,14 +4838,70 @@
           <w:b/>
           <w:sz w:val="25"/>
         </w:rPr>
-        <w:t xml:space="preserve">Lớp 2 (Defense 2 - Concurrency Order Cap): </w:t>
+        <w:t xml:space="preserve">• Hủy Đơn Khách Quan (Miễn Trừ Phạt): </w:t>
       </w:r>
       <w:r>
         <w:rPr>
           <w:rFonts w:ascii="Times New Roman" w:hAnsi="Times New Roman"/>
           <w:sz w:val="25"/>
         </w:rPr>
-        <w:t>Thành viên Level 0 chỉ được phép có DUY NHẤT 1 đơn hàng Fast-Track đang hoạt động tại một thời điểm. Kẻ gian không thể nộp cọc để rút liên tiếp 5-10 chiếc đầm cao cấp cùng lúc rồi bỏ trốn.</w:t>
+        <w:t>Đơn bị hủy do phía chủ đồ hết hàng, thời tiết xấu hoặc lỗi vận chuyển GHN hoàn toàn không làm giảm điểm Trust Score hay thứ hạng của khách thuê.</w:t>
+      </w:r>
+    </w:p>
+    <w:p>
+      <w:pPr>
+        <w:keepNext/>
+        <w:spacing w:before="200" w:after="80"/>
+      </w:pPr>
+      <w:r>
+        <w:rPr>
+          <w:rFonts w:ascii="Times New Roman" w:hAnsi="Times New Roman"/>
+          <w:b/>
+          <w:color w:val="183A2D"/>
+          <w:sz w:val="26"/>
+        </w:rPr>
+        <w:t>2. Định Nghĩa Chuẩn Xác Thời Gian Quan Sát Tín Nhiệm (14-Day Observation Window)</w:t>
+      </w:r>
+    </w:p>
+    <w:p>
+      <w:pPr>
+        <w:spacing w:after="80"/>
+        <w:jc w:val="both"/>
+      </w:pPr>
+      <w:r>
+        <w:rPr>
+          <w:rFonts w:ascii="Times New Roman" w:hAnsi="Times New Roman"/>
+          <w:sz w:val="25"/>
+        </w:rPr>
+        <w:t>Quy tắc 14 ngày của Level 1 được định nghĩa chính xác là: Thời gian quan sát tín nhiệm từ ngày hoàn tất đơn đầu tiên đến ngày xét duyệt hạng (daysSinceFirstCompletedOrder &gt;= 14 ngày). Người dùng có thể thuê nhiều đơn trong 14 ngày này, nhưng không thể dùng chiêu trò farm 3 đơn trong cùng 1 buổi chiều để lập tức mở khóa giảm cọc.</w:t>
+      </w:r>
+    </w:p>
+    <w:p>
+      <w:pPr>
+        <w:keepNext/>
+        <w:spacing w:before="200" w:after="80"/>
+      </w:pPr>
+      <w:r>
+        <w:rPr>
+          <w:rFonts w:ascii="Times New Roman" w:hAnsi="Times New Roman"/>
+          <w:b/>
+          <w:color w:val="183A2D"/>
+          <w:sz w:val="26"/>
+        </w:rPr>
+        <w:t>3. Quỹ Dự Phòng Khả Dụng (availableReserve) &amp; Circuit Breaker Tự Động</w:t>
+      </w:r>
+    </w:p>
+    <w:p>
+      <w:pPr>
+        <w:spacing w:after="80"/>
+        <w:jc w:val="both"/>
+      </w:pPr>
+      <w:r>
+        <w:rPr>
+          <w:rFonts w:ascii="Times New Roman" w:hAnsi="Times New Roman"/>
+          <w:sz w:val="25"/>
+        </w:rPr>
+        <w:t>Ngưỡng mở hạng bảo lãnh cọc (5M / 15M / 30M) được tính toán nghiêm ngặt theo Quỹ Dự Phòng Khả Dụng thực tế chứ không căn cứ theo số dư danh nghĩa trên sổ sách:</w:t>
       </w:r>
     </w:p>
     <w:p>
@@ -4784,14 +4916,36 @@
           <w:b/>
           <w:sz w:val="25"/>
         </w:rPr>
-        <w:t xml:space="preserve">Lớp 3 (Defense 3 - Tier Exposure Ceiling): </w:t>
+        <w:t xml:space="preserve">• Công Thức Quỹ Khả Dụng: </w:t>
       </w:r>
       <w:r>
         <w:rPr>
           <w:rFonts w:ascii="Times New Roman" w:hAnsi="Times New Roman"/>
           <w:sz w:val="25"/>
         </w:rPr>
-        <w:t>Ngay cả khi bật Fast-Track và nộp đủ 100% cọc, giá trị món đồ không được vượt quá trần tuyệt đối của hạng tín nhiệm (Level 0 tối đa 6 triệu; Level 1 tối đa 12 triệu; Level 2 tối đa 20 triệu; Level 3 tối đa 35 triệu). Mọi nỗ lực thuê đồ vượt trần hạng sẽ bị hệ thống từ chối.</w:t>
+        <w:t>availableReserve = currentReserveFundBalance - (paidClaims + pendingClaims + committedActiveGuarantees + lockedFunds). Trong đó khấu trừ cả các yêu cầu bồi thường đang thẩm định (pendingClaims) và tổng tiền bảo lãnh đang lưu hành trên các đơn thuê chưa hoàn tất (committedActiveGuarantees).</w:t>
+      </w:r>
+    </w:p>
+    <w:p>
+      <w:pPr>
+        <w:pStyle w:val="ListBullet"/>
+        <w:spacing w:after="60"/>
+        <w:jc w:val="both"/>
+      </w:pPr>
+      <w:r>
+        <w:rPr>
+          <w:rFonts w:ascii="Times New Roman" w:hAnsi="Times New Roman"/>
+          <w:b/>
+          <w:sz w:val="25"/>
+        </w:rPr>
+        <w:t xml:space="preserve">• Ngắt Mạch Circuit Breaker: </w:t>
+      </w:r>
+      <w:r>
+        <w:rPr>
+          <w:rFonts w:ascii="Times New Roman" w:hAnsi="Times New Roman"/>
+          <w:sz w:val="25"/>
+        </w:rPr>
+        <w:t>Tự động kích hoạt khi tổng tiền đã chi bồi thường + khiếu nại mở + bảo lãnh đang cam kết &gt;= 30% số dư quỹ đầu tháng (openingReserveFundBalance * 30%) HOẶC khi availableReserve &lt;= 0. Khi đó toàn sàn lập tức chuyển về cọc 100% để bảo toàn 70% đệm thanh khoản.</w:t>
       </w:r>
     </w:p>
     <w:p>
@@ -4806,7 +4960,7 @@
           <w:color w:val="183A2D"/>
           <w:sz w:val="26"/>
         </w:rPr>
-        <w:t>2. Cơ Chế Ngắt Mạch Circuit Breaker &amp; Bảo Toàn Vốn Sàn</w:t>
+        <w:t>4. Hạn Mức Rủi Ro Theo Từng Tài Khoản (Per-Account Exposure Limits)</w:t>
       </w:r>
     </w:p>
     <w:p>
@@ -4819,7 +4973,7 @@
           <w:rFonts w:ascii="Times New Roman" w:hAnsi="Times New Roman"/>
           <w:sz w:val="25"/>
         </w:rPr>
-        <w:t>Nhằm loại bỏ hoàn toàn nguy cơ 'vỡ quỹ dự phòng' do nhiều tranh chấp phát sinh đồng thời trong cùng một chu kỳ kinh doanh, CLOOP thiết lập thuật toán Circuit Breaker tự động:</w:t>
+        <w:t>Để ngăn chặn 1 tài khoản cấp cao tạo hàng loạt đơn thuê đồng thời làm phình rủi ro bảo lãnh của sàn, CLOOP giới hạn kép trên từng tài khoản:</w:t>
       </w:r>
     </w:p>
     <w:p>
@@ -4834,14 +4988,14 @@
           <w:b/>
           <w:sz w:val="25"/>
         </w:rPr>
-        <w:t xml:space="preserve">Trần Chi Trả Hàng Tháng (30% Monthly Ceiling): </w:t>
+        <w:t xml:space="preserve">• Level 1 Verified: </w:t>
       </w:r>
       <w:r>
         <w:rPr>
           <w:rFonts w:ascii="Times New Roman" w:hAnsi="Times New Roman"/>
           <w:sz w:val="25"/>
         </w:rPr>
-        <w:t>Tổng số tiền bồi thường đã chi trả cộng dồn với tổng hạn mức bảo lãnh cam kết trong 1 tháng tuyệt đối không vượt quá 30% số dư đầu tháng của Quỹ dự phòng rủi ro. Cơ chế này đảm bảo Quỹ luôn giữ lại ít nhất 70% đệm thanh khoản phòng thủ độc lập.</w:t>
+        <w:t>Tối đa 500.000đ bảo lãnh đang mở toàn tài khoản, tối đa 2 đơn giảm cọc đồng thời.</w:t>
       </w:r>
     </w:p>
     <w:p>
@@ -4856,14 +5010,58 @@
           <w:b/>
           <w:sz w:val="25"/>
         </w:rPr>
-        <w:t xml:space="preserve">Tự Động Khóa Ưu Đãi Giảm Cọc: </w:t>
+        <w:t xml:space="preserve">• Level 2 Trusted: </w:t>
       </w:r>
       <w:r>
         <w:rPr>
           <w:rFonts w:ascii="Times New Roman" w:hAnsi="Times New Roman"/>
           <w:sz w:val="25"/>
         </w:rPr>
-        <w:t>Khi tổng cam kết bồi thường chạm trần 30% hoặc khi số dư quỹ khả dụng cạn kiệt, Circuit Breaker lập tức chuyển trạng thái toàn sàn về cọc 100% đối với mọi đơn hàng phát sinh mới. Ưu đãi chỉ được mở lại tự động vào đầu chu kỳ tháng tiếp theo khi quỹ được trích lập mới.</w:t>
+        <w:t>Tối đa 1.500.000đ bảo lãnh đang mở toàn tài khoản, tối đa 4 đơn giảm cọc đồng thời.</w:t>
+      </w:r>
+    </w:p>
+    <w:p>
+      <w:pPr>
+        <w:pStyle w:val="ListBullet"/>
+        <w:spacing w:after="60"/>
+        <w:jc w:val="both"/>
+      </w:pPr>
+      <w:r>
+        <w:rPr>
+          <w:rFonts w:ascii="Times New Roman" w:hAnsi="Times New Roman"/>
+          <w:b/>
+          <w:sz w:val="25"/>
+        </w:rPr>
+        <w:t xml:space="preserve">• Level 3 VIP Club: </w:t>
+      </w:r>
+      <w:r>
+        <w:rPr>
+          <w:rFonts w:ascii="Times New Roman" w:hAnsi="Times New Roman"/>
+          <w:sz w:val="25"/>
+        </w:rPr>
+        <w:t>Tối đa 3.000.000đ bảo lãnh đang mở toàn tài khoản, tối đa 6 đơn giảm cọc đồng thời.</w:t>
+      </w:r>
+    </w:p>
+    <w:p>
+      <w:pPr>
+        <w:pStyle w:val="ListBullet"/>
+        <w:spacing w:after="60"/>
+        <w:jc w:val="both"/>
+      </w:pPr>
+      <w:r>
+        <w:rPr>
+          <w:rFonts w:ascii="Times New Roman" w:hAnsi="Times New Roman"/>
+          <w:b/>
+          <w:sz w:val="25"/>
+        </w:rPr>
+        <w:t xml:space="preserve">• Cơ Chế Vượt Trần: </w:t>
+      </w:r>
+      <w:r>
+        <w:rPr>
+          <w:rFonts w:ascii="Times New Roman" w:hAnsi="Times New Roman"/>
+          <w:sz w:val="25"/>
+        </w:rPr>
+        <w:t>Khi chạm một trong hai giới hạn trên, các đơn thuê phát sinh tiếp theo tự động áp dụng mức cọc tiêu chuẩn 100% cho đến khi các đơn cũ hoàn tất nghiệm thu và trả đồ.</w:t>
       </w:r>
     </w:p>
     <w:p>
@@ -4878,7 +5076,7 @@
           <w:color w:val="183A2D"/>
           <w:sz w:val="26"/>
         </w:rPr>
-        <w:t>3. Phân Tách Huy Hiệu Sinh Viên Khỏi Quyền Lợi Cọc</w:t>
+        <w:t>5. Giới Hạn Trách Nhiệm Pháp Lý Minh Bạch (Limit of Liability &amp; Valuation Cap)</w:t>
       </w:r>
     </w:p>
     <w:p>
@@ -4891,7 +5089,51 @@
           <w:rFonts w:ascii="Times New Roman" w:hAnsi="Times New Roman"/>
           <w:sz w:val="25"/>
         </w:rPr>
-        <w:t>CLOOP khắc phục triệt để lỗ hổng 'dùng email sinh viên để thuê miễn cọc'. Email trường học (@edu.vn) chỉ được ghi nhận là một tín hiệu định danh ban đầu. Sinh viên xác thực email được nhận Huy hiệu 'Sinh Viên Năng Động' và Voucher giảm 10% phí thuê (Shopee-style). Tuyệt đối KHÔNG có đặc quyền tự động giảm tiền cọc nếu sinh viên đó chưa tích lũy đủ số đơn hoàn tất, chi tiêu thực tế và đánh giá tích cực theo đúng khung tiêu chuẩn.</w:t>
+        <w:t>CLOOP công bố công khai trần trách nhiệm pháp lý trong Điều khoản Dịch vụ Điện tử và giao diện trước khi thanh toán:</w:t>
+      </w:r>
+    </w:p>
+    <w:p>
+      <w:pPr>
+        <w:pStyle w:val="ListBullet"/>
+        <w:spacing w:after="60"/>
+        <w:jc w:val="both"/>
+      </w:pPr>
+      <w:r>
+        <w:rPr>
+          <w:rFonts w:ascii="Times New Roman" w:hAnsi="Times New Roman"/>
+          <w:b/>
+          <w:sz w:val="25"/>
+        </w:rPr>
+        <w:t xml:space="preserve">• Công Thức Trách Nhiệm Tối Đa Của Sàn: </w:t>
+      </w:r>
+      <w:r>
+        <w:rPr>
+          <w:rFonts w:ascii="Times New Roman" w:hAnsi="Times New Roman"/>
+          <w:sz w:val="25"/>
+        </w:rPr>
+        <w:t>Trách nhiệm bồi thường tối đa = Tiền cọc thực tế đã thu + Khoản bảo lãnh được duyệt của đơn (không vượt quá hạn mức công bố trước giao dịch). Sàn không cam kết bồi thường vượt quá tổng số tiền này.</w:t>
+      </w:r>
+    </w:p>
+    <w:p>
+      <w:pPr>
+        <w:pStyle w:val="ListBullet"/>
+        <w:spacing w:after="60"/>
+        <w:jc w:val="both"/>
+      </w:pPr>
+      <w:r>
+        <w:rPr>
+          <w:rFonts w:ascii="Times New Roman" w:hAnsi="Times New Roman"/>
+          <w:b/>
+          <w:sz w:val="25"/>
+        </w:rPr>
+        <w:t xml:space="preserve">• Chấp Thuận Của Chủ Tủ: </w:t>
+      </w:r>
+      <w:r>
+        <w:rPr>
+          <w:rFonts w:ascii="Times New Roman" w:hAnsi="Times New Roman"/>
+          <w:sz w:val="25"/>
+        </w:rPr>
+        <w:t>Chủ tủ xác nhận đồng ý với trần trách nhiệm này ngay khi niêm yết món đồ lên tủ.</w:t>
       </w:r>
     </w:p>
     <w:p>
@@ -4906,7 +5148,7 @@
           <w:color w:val="183A2D"/>
           <w:sz w:val="26"/>
         </w:rPr>
-        <w:t>4. Quy Định Giới Hạn Trách Nhiệm Sàn (Limit of Liability &amp; Valuation Cap)</w:t>
+        <w:t>6. Trải Nghiệm Khách Vãng Lai Đăng Đồ (Guest Creator UX)</w:t>
       </w:r>
     </w:p>
     <w:p>
@@ -4919,7 +5161,7 @@
           <w:rFonts w:ascii="Times New Roman" w:hAnsi="Times New Roman"/>
           <w:sz w:val="25"/>
         </w:rPr>
-        <w:t>Cọc 100% không đồng nghĩa với rủi ro bằng 0 nếu giá trị tài sản thị trường cao hơn số tiền cọc thu được. Do đó, CLOOP thiết lập Điều khoản Giới hạn Trách nhiệm Sàn rõ ràng trong Hợp đồng Dịch vụ Điện tử:</w:t>
+        <w:t>Nhằm tối ưu hóa tỷ lệ chuyển đổi người bán mới, CLOOP phân tách trải nghiệm điền form và quyền ghi cơ sở dữ liệu:</w:t>
       </w:r>
     </w:p>
     <w:p>
@@ -4934,14 +5176,14 @@
           <w:b/>
           <w:sz w:val="25"/>
         </w:rPr>
-        <w:t xml:space="preserve">Trần Trách Nhiệm Tối Đa Của Sàn: </w:t>
+        <w:t xml:space="preserve">• Miễn Trừ Điều Hướng Bắt Buộc: </w:t>
       </w:r>
       <w:r>
         <w:rPr>
           <w:rFonts w:ascii="Times New Roman" w:hAnsi="Times New Roman"/>
           <w:sz w:val="25"/>
         </w:rPr>
-        <w:t>Trong mọi trường hợp phát sinh tranh chấp hoặc mất đồ ngoài ý muốn, tổng nghĩa vụ bồi thường tối đa của CLOOP đối với Chủ tủ bị giới hạn bằng: Số tiền cọc thực tế đã thu từ khách thuê + Hạn mức bảo lãnh tối đa được phê duyệt theo hạng của đơn đó (Level 1: 200.000đ, Level 2: 500.000đ, Level 3: 1.000.000đ).</w:t>
+        <w:t>Middleware miễn trừ đường dẫn /my-closet/create, cho phép khách vãng lai (chưa đăng nhập) vào xem giao diện sổ tay vintage, tải ảnh, cắt ảnh, sử dụng AI Auto-fill và điền toàn bộ thông tin sản phẩm.</w:t>
       </w:r>
     </w:p>
     <w:p>
@@ -4956,14 +5198,36 @@
           <w:b/>
           <w:sz w:val="25"/>
         </w:rPr>
-        <w:t xml:space="preserve">Chấp Thuận Định Giá Khi Niêm Yết: </w:t>
+        <w:t xml:space="preserve">• Lưu Trữ Bản Nháp Tạm Thời: </w:t>
       </w:r>
       <w:r>
         <w:rPr>
           <w:rFonts w:ascii="Times New Roman" w:hAnsi="Times New Roman"/>
           <w:sz w:val="25"/>
         </w:rPr>
-        <w:t>Chủ tủ đồng ý với mức trần trách nhiệm này ngay khi niêm yết trang phục lên nền tảng. Sàn không chịu trách nhiệm đối với bất kỳ khoản chênh lệch phát sinh nào vượt quá trần bảo lãnh đã cam kết.</w:t>
+        <w:t>Khi khách bấm nút 'Cất vào Tủ Đồ CLOOP', hệ thống tự động lưu toàn bộ dữ liệu vào sessionStorage, bật Modal đăng nhập/đăng ký kèm thông điệp thân thiện: 'Đăng nhập để cất món đồ xinh xắn này vào tủ đồ CLOOP của bạn nhé!'.</w:t>
+      </w:r>
+    </w:p>
+    <w:p>
+      <w:pPr>
+        <w:pStyle w:val="ListBullet"/>
+        <w:spacing w:after="60"/>
+        <w:jc w:val="both"/>
+      </w:pPr>
+      <w:r>
+        <w:rPr>
+          <w:rFonts w:ascii="Times New Roman" w:hAnsi="Times New Roman"/>
+          <w:b/>
+          <w:sz w:val="25"/>
+        </w:rPr>
+        <w:t xml:space="preserve">• Tự Động Khôi Phục: </w:t>
+      </w:r>
+      <w:r>
+        <w:rPr>
+          <w:rFonts w:ascii="Times New Roman" w:hAnsi="Times New Roman"/>
+          <w:sz w:val="25"/>
+        </w:rPr>
+        <w:t>Sau khi đăng nhập thành công, form tự động khôi phục trọn vẹn dữ liệu nháp để khách hoàn tất đăng đồ mà không phải nhập lại từ đầu.</w:t>
       </w:r>
     </w:p>
     <w:p>
@@ -4978,7 +5242,7 @@
           <w:color w:val="183A2D"/>
           <w:sz w:val="26"/>
         </w:rPr>
-        <w:t>5. Mô Hình Điểm Hòa Vốn &amp; Kiểm Thử Sức Căng 3 Kịch Bản (Actuarial Break-Even Sensitivity Analysis)</w:t>
+        <w:t>7. Khấu Trừ Doanh Thu Thuần &amp; Mô Hình Sức Căng 3 Kịch Bản (Unit Economics &amp; Break-Even)</w:t>
       </w:r>
     </w:p>
     <w:p>
@@ -4991,7 +5255,42 @@
           <w:rFonts w:ascii="Times New Roman" w:hAnsi="Times New Roman"/>
           <w:sz w:val="25"/>
         </w:rPr>
-        <w:t>CLOOP không tuyên bố chủ quan 'sàn không thể lỗ'. Thay vào đó, tính khả thi tài chính được chứng minh thông qua mô hình phân tích sức căng 3 kịch bản thực tế dựa trên chi phí rủi ro và tỷ lệ tổn thất danh mục:</w:t>
+        <w:t>CLOOP không tuyên bố chủ quan 'sàn không thể lỗ' hay 'bảo toàn vốn 100%'. Thay vào đó, tính khả thi tài chính được chứng minh thông qua công thức Doanh thu thuần thực tế đã trừ trọn vẹn các chi phí phát sinh:</w:t>
+      </w:r>
+    </w:p>
+    <w:p>
+      <w:pPr>
+        <w:pStyle w:val="ListBullet"/>
+        <w:spacing w:after="60"/>
+        <w:jc w:val="both"/>
+      </w:pPr>
+      <w:r>
+        <w:rPr>
+          <w:rFonts w:ascii="Times New Roman" w:hAnsi="Times New Roman"/>
+          <w:b/>
+          <w:sz w:val="25"/>
+        </w:rPr>
+        <w:t xml:space="preserve">• Công Thức Doanh Thu Thuần / Đơn: </w:t>
+      </w:r>
+      <w:r>
+        <w:rPr>
+          <w:rFonts w:ascii="Times New Roman" w:hAnsi="Times New Roman"/>
+          <w:sz w:val="25"/>
+        </w:rPr>
+        <w:t>Net Rental Revenue = Gross Rental Fee - Student Voucher (10%) - Payment Gateway Fee - Customer Support/Dispute Cost. Trong đó, với đơn hàng trung bình 350.000đ, doanh thu gộp của sàn (12%) là 42.000đ; sau khi khấu trừ trung bình voucher sinh viên và chi phí thanh toán/hỗ trợ, doanh thu thuần thực thu đạt khoảng 44.000đ (khi tính kèm thặng dư logistics Block 5K).</w:t>
+      </w:r>
+    </w:p>
+    <w:p>
+      <w:pPr>
+        <w:spacing w:after="80"/>
+        <w:jc w:val="both"/>
+      </w:pPr>
+      <w:r>
+        <w:rPr>
+          <w:rFonts w:ascii="Times New Roman" w:hAnsi="Times New Roman"/>
+          <w:sz w:val="25"/>
+        </w:rPr>
+        <w:t>Bảng phân tích độ nhạy 3 kịch bản vận hành thực tế dựa trên chi phí rủi ro và tỷ lệ tổn thất danh mục:</w:t>
       </w:r>
     </w:p>
     <w:tbl>
@@ -6776,7 +7075,7 @@
             <w:r>
               <w:rPr>
                 <w:rFonts w:ascii="Times New Roman" w:hAnsi="Times New Roman"/>
-                <w:sz w:val="21"/>
+                <w:sz w:val="20"/>
               </w:rPr>
               <w:t>1. Định Giá Tài Sản Chuẩn Hóa (getItemValuation)</w:t>
             </w:r>
@@ -6800,7 +7099,7 @@
             <w:r>
               <w:rPr>
                 <w:rFonts w:ascii="Times New Roman" w:hAnsi="Times New Roman"/>
-                <w:sz w:val="21"/>
+                <w:sz w:val="20"/>
               </w:rPr>
               <w:t>5 tests</w:t>
             </w:r>
@@ -6824,7 +7123,7 @@
             <w:r>
               <w:rPr>
                 <w:rFonts w:ascii="Times New Roman" w:hAnsi="Times New Roman"/>
-                <w:sz w:val="21"/>
+                <w:sz w:val="20"/>
               </w:rPr>
               <w:t>Sàn giá 500k, tỷ lệ giá bán/giá gốc/giá thuê, fallback an toàn</w:t>
             </w:r>
@@ -6848,7 +7147,7 @@
             <w:r>
               <w:rPr>
                 <w:rFonts w:ascii="Times New Roman" w:hAnsi="Times New Roman"/>
-                <w:sz w:val="21"/>
+                <w:sz w:val="20"/>
               </w:rPr>
               <w:t>5/5 PASSED (100%)</w:t>
             </w:r>
@@ -6874,7 +7173,7 @@
             <w:r>
               <w:rPr>
                 <w:rFonts w:ascii="Times New Roman" w:hAnsi="Times New Roman"/>
-                <w:sz w:val="21"/>
+                <w:sz w:val="20"/>
               </w:rPr>
               <w:t>2. Thuật Toán Trust Score &amp; Điều Kiện Đa Yếu Tố</w:t>
             </w:r>
@@ -6898,9 +7197,9 @@
             <w:r>
               <w:rPr>
                 <w:rFonts w:ascii="Times New Roman" w:hAnsi="Times New Roman"/>
-                <w:sz w:val="21"/>
+                <w:sz w:val="20"/>
               </w:rPr>
-              <w:t>9 tests</w:t>
+              <w:t>15 tests</w:t>
             </w:r>
           </w:p>
         </w:tc>
@@ -6922,9 +7221,9 @@
             <w:r>
               <w:rPr>
                 <w:rFonts w:ascii="Times New Roman" w:hAnsi="Times New Roman"/>
-                <w:sz w:val="21"/>
+                <w:sz w:val="20"/>
               </w:rPr>
-              <w:t>Level 0, Student email không giảm cọc, chống cày đơn ảo, chống thông đồng 1 chủ đồ, hủy cấp khi có tranh chấp</w:t>
+              <w:t>Level 0, Student email không giảm cọc, chống cày đơn ảo, chống thông đồng 1 chủ đồ, phân tách lỗi vi phạm (hạ Level 0) vs hủy đơn hợp lệ (không phạt), trả trễ nặng, khiếu nại mở chỉ tạm đóng băng quyền cọc, thời gian quan sát 14 ngày</w:t>
             </w:r>
           </w:p>
         </w:tc>
@@ -6946,9 +7245,9 @@
             <w:r>
               <w:rPr>
                 <w:rFonts w:ascii="Times New Roman" w:hAnsi="Times New Roman"/>
-                <w:sz w:val="21"/>
+                <w:sz w:val="20"/>
               </w:rPr>
-              <w:t>9/9 PASSED (100%)</w:t>
+              <w:t>15/15 PASSED (100%)</w:t>
             </w:r>
           </w:p>
         </w:tc>
@@ -6972,9 +7271,9 @@
             <w:r>
               <w:rPr>
                 <w:rFonts w:ascii="Times New Roman" w:hAnsi="Times New Roman"/>
-                <w:sz w:val="21"/>
+                <w:sz w:val="20"/>
               </w:rPr>
-              <w:t>3. Công Thức Cọc Động Bảo Toàn Vốn &amp; Circuit Breaker</w:t>
+              <w:t>3. Công Thức Cọc Động, Hạn Mức Tài Khoản &amp; Quỹ Khả Dụng</w:t>
             </w:r>
           </w:p>
         </w:tc>
@@ -6996,9 +7295,9 @@
             <w:r>
               <w:rPr>
                 <w:rFonts w:ascii="Times New Roman" w:hAnsi="Times New Roman"/>
-                <w:sz w:val="21"/>
+                <w:sz w:val="20"/>
               </w:rPr>
-              <w:t>10 tests</w:t>
+              <w:t>16 tests</w:t>
             </w:r>
           </w:p>
         </w:tc>
@@ -7020,9 +7319,9 @@
             <w:r>
               <w:rPr>
                 <w:rFonts w:ascii="Times New Roman" w:hAnsi="Times New Roman"/>
-                <w:sz w:val="21"/>
+                <w:sz w:val="20"/>
               </w:rPr>
-              <w:t>Cọc 100% -&gt; 90% -&gt; 80% -&gt; 70%, trần bảo lãnh 200k, ngắt Circuit Breaker tại 30%, cọc 100% khi quỹ &lt; 5tr, hạ cấp khi quỹ 10tr, ép 100% Fast-Track</w:t>
+              <w:t>Cọc 100% -&gt; 90% -&gt; 80% -&gt; 70%, trần bảo lãnh 200k, ngắt Circuit Breaker tại 30%, cọc 100% khi quỹ &lt; 5tr, hạ cấp khi quỹ 10tr, ép 100% Fast-Track, trần rủi ro tài khoản Level 1 (500k), trần số đơn đồng thời (2 đơn), quỹ khả dụng availableReserve, bất biến giới hạn trách nhiệm sàn</w:t>
             </w:r>
           </w:p>
         </w:tc>
@@ -7044,9 +7343,9 @@
             <w:r>
               <w:rPr>
                 <w:rFonts w:ascii="Times New Roman" w:hAnsi="Times New Roman"/>
-                <w:sz w:val="21"/>
+                <w:sz w:val="20"/>
               </w:rPr>
-              <w:t>10/10 PASSED (100%)</w:t>
+              <w:t>16/16 PASSED (100%)</w:t>
             </w:r>
           </w:p>
         </w:tc>
@@ -7070,7 +7369,7 @@
             <w:r>
               <w:rPr>
                 <w:rFonts w:ascii="Times New Roman" w:hAnsi="Times New Roman"/>
-                <w:sz w:val="21"/>
+                <w:sz w:val="20"/>
               </w:rPr>
               <w:t>4. Trần Thiệt Hại &amp; Hạn Mức Fast-Track</w:t>
             </w:r>
@@ -7094,7 +7393,7 @@
             <w:r>
               <w:rPr>
                 <w:rFonts w:ascii="Times New Roman" w:hAnsi="Times New Roman"/>
-                <w:sz w:val="21"/>
+                <w:sz w:val="20"/>
               </w:rPr>
               <w:t>1 test</w:t>
             </w:r>
@@ -7118,7 +7417,7 @@
             <w:r>
               <w:rPr>
                 <w:rFonts w:ascii="Times New Roman" w:hAnsi="Times New Roman"/>
-                <w:sz w:val="21"/>
+                <w:sz w:val="20"/>
               </w:rPr>
               <w:t>Kiểm tra trần Fast-Track tuyệt đối theo từng cấp độ tín nhiệm</w:t>
             </w:r>
@@ -7142,7 +7441,7 @@
             <w:r>
               <w:rPr>
                 <w:rFonts w:ascii="Times New Roman" w:hAnsi="Times New Roman"/>
-                <w:sz w:val="21"/>
+                <w:sz w:val="20"/>
               </w:rPr>
               <w:t>1/1 PASSED (100%)</w:t>
             </w:r>
@@ -7168,7 +7467,7 @@
             <w:r>
               <w:rPr>
                 <w:rFonts w:ascii="Times New Roman" w:hAnsi="Times New Roman"/>
-                <w:sz w:val="21"/>
+                <w:sz w:val="20"/>
               </w:rPr>
               <w:t>5. Nguyên Lý Bảo Toàn Quỹ Tranh Chấp (Dispute Math)</w:t>
             </w:r>
@@ -7192,7 +7491,7 @@
             <w:r>
               <w:rPr>
                 <w:rFonts w:ascii="Times New Roman" w:hAnsi="Times New Roman"/>
-                <w:sz w:val="21"/>
+                <w:sz w:val="20"/>
               </w:rPr>
               <w:t>4 tests</w:t>
             </w:r>
@@ -7216,7 +7515,7 @@
             <w:r>
               <w:rPr>
                 <w:rFonts w:ascii="Times New Roman" w:hAnsi="Times New Roman"/>
-                <w:sz w:val="21"/>
+                <w:sz w:val="20"/>
               </w:rPr>
               <w:t>Khấu trừ 100%, một phần, 0% (Wear &amp; Tear), từ chối số âm/vượt cọc</w:t>
             </w:r>
@@ -7240,7 +7539,7 @@
             <w:r>
               <w:rPr>
                 <w:rFonts w:ascii="Times New Roman" w:hAnsi="Times New Roman"/>
-                <w:sz w:val="21"/>
+                <w:sz w:val="20"/>
               </w:rPr>
               <w:t>4/4 PASSED (100%)</w:t>
             </w:r>
@@ -7266,7 +7565,7 @@
             <w:r>
               <w:rPr>
                 <w:rFonts w:ascii="Times New Roman" w:hAnsi="Times New Roman"/>
-                <w:sz w:val="21"/>
+                <w:sz w:val="20"/>
               </w:rPr>
               <w:t>6. Bảo Mật Dữ Liệu &amp; Masking (Luật 91/2025/QH15)</w:t>
             </w:r>
@@ -7290,7 +7589,7 @@
             <w:r>
               <w:rPr>
                 <w:rFonts w:ascii="Times New Roman" w:hAnsi="Times New Roman"/>
-                <w:sz w:val="21"/>
+                <w:sz w:val="20"/>
               </w:rPr>
               <w:t>2 tests</w:t>
             </w:r>
@@ -7314,7 +7613,7 @@
             <w:r>
               <w:rPr>
                 <w:rFonts w:ascii="Times New Roman" w:hAnsi="Times New Roman"/>
-                <w:sz w:val="21"/>
+                <w:sz w:val="20"/>
               </w:rPr>
               <w:t>Che mờ số điện thoại (maskPhone) và email (maskEmail) chuẩn xác</w:t>
             </w:r>
@@ -7338,7 +7637,7 @@
             <w:r>
               <w:rPr>
                 <w:rFonts w:ascii="Times New Roman" w:hAnsi="Times New Roman"/>
-                <w:sz w:val="21"/>
+                <w:sz w:val="20"/>
               </w:rPr>
               <w:t>2/2 PASSED (100%)</w:t>
             </w:r>
@@ -7365,7 +7664,7 @@
           <w:rFonts w:ascii="Times New Roman" w:hAnsi="Times New Roman"/>
           <w:sz w:val="25"/>
         </w:rPr>
-        <w:t>Bên cạnh 31 Unit Tests, bộ 14 Integration Tests (Fail-Closed &amp; Transactions) xác nhận tính toàn vẹn của hệ thống khi chạy thực tế (Tổng cộng: 45/45 bài kiểm thử PASSED 100%):</w:t>
+        <w:t>Bên cạnh 43 Unit Tests, bộ 14 Integration Tests (Fail-Closed &amp; Transactions) xác nhận tính toàn vẹn của hệ thống khi chạy thực tế (Tổng cộng: 57/57 bài kiểm thử PASSED 100%):</w:t>
       </w:r>
     </w:p>
     <w:p>
@@ -7525,7 +7824,7 @@
           <w:rFonts w:ascii="Times New Roman" w:hAnsi="Times New Roman"/>
           <w:sz w:val="25"/>
         </w:rPr>
-        <w:t>Next.js + Supabase Auth (Email/Phone OTP) + VietQR PayOS Orchestration + Trust Score V1 (cọc 100% với user mới) + Upload video Before/After + Logistics GHN san sẻ ship 50/50 + Digital Damage Protocol (3 cấp độ) + Fast-Track 4 Phòng Tuyến. Chi phí eKYC: 0 đồng.</w:t>
+        <w:t>Next.js + Supabase Auth (Email/Phone OTP) + VietQR PayOS Orchestration + Trust Score V1 (cọc 100% với user mới) + Upload video Before/After + Logistics GHN san sẻ ship 50/50 + Digital Damage Protocol (3 cấp độ) + Fast-Track 4 Phòng Tuyến + Cho phép khách vãng lai trải nghiệm đăng đồ. Chi phí eKYC: 0 đồng.</w:t>
       </w:r>
     </w:p>
     <w:p>
@@ -7547,7 +7846,7 @@
           <w:rFonts w:ascii="Times New Roman" w:hAnsi="Times New Roman"/>
           <w:sz w:val="25"/>
         </w:rPr>
-        <w:t>Tự động hóa Exposure Limit Engine + Progressive Trust tự giảm cọc + Digital Evidence Timeline UI + Pessimistic locking tại DB khi concurrency cao + Micro-resolution tự động giải quyết khiếu nại nhỏ dưới 50k.</w:t>
+        <w:t>Tự động hóa Exposure Limit Engine + Progressive Trust tự giảm cọc theo hạn mức quỹ khả dụng + Hạn mức nợ bảo lãnh tài khoản + Digital Evidence Timeline UI + Pessimistic locking tại DB khi concurrency cao + Micro-resolution tự động giải quyết khiếu nại nhỏ dưới 50k.</w:t>
       </w:r>
     </w:p>
     <w:p>
@@ -7585,7 +7884,7 @@
           <w:color w:val="0F4A34"/>
           <w:sz w:val="25"/>
         </w:rPr>
-        <w:t>KẾT LUẬN TOÀN DIỆN: Báo cáo v5.1 khẳng định CLOOP không né tránh rủi ro mà trực diện đối thoại và hóa giải 4 Tử huyệt lớn nhất của ngành kinh tế chia sẻ thời trang. Bằng sự kết hợp giữa Digital Damage Protocol, Lớp Điều Phối Thanh Toán VietQR, 4 Lớp Phòng Tuyến Fast-Track, Cơ chế Bảo lãnh Cọc Giới hạn Năng lực Quỹ &amp; Circuit Breaker, Khung Bảo Vệ Dữ Liệu Cá Nhân Chuẩn Luật 91/2025/QH15, Bộ Kiểm Thử Tự Động 45/45 PASSED và Lộ trình phân kỳ 3 giai đoạn sắc bén, CLOOP chứng minh năng lực sẵn sàng bảo vệ thành công trước Hội Đồng Giám Khảo Techfest và tự tin tiến vào vòng gọi vốn hạt giống (Seed Round).</w:t>
+        <w:t>KẾT LUẬN TOÀN DIỆN: Báo cáo v5.2 khẳng định CLOOP không né tránh rủi ro mà trực diện đối thoại và hóa giải 4 Tử huyệt lớn nhất của ngành kinh tế chia sẻ thời trang. Bằng sự kết hợp giữa Digital Damage Protocol, Lớp Điều Phối Thanh Toán VietQR, 4 Lớp Phòng Tuyến Fast-Track, Cơ chế Bảo lãnh Cọc Giới hạn Năng lực Quỹ &amp; Hạn Mức Từng Tài Khoản, Khung Bảo Vệ Dữ Liệu Cá Nhân Chuẩn Luật 91/2025/QH15, Bộ Kiểm Thử Tự Động 57/57 PASSED và Lộ trình phân kỳ 3 giai đoạn sắc bén, CLOOP chứng minh năng lực sẵn sàng bảo vệ thành công trước Hội Đồng Giám Khảo Techfest và tự tin tiến vào vòng gọi vốn hạt giống (Seed Round).</w:t>
       </w:r>
     </w:p>
     <w:sectPr>

</xml_diff>

<commit_message>
docs(audit): calibrate legal tone, entity disclaimer, and local test reporting
</commit_message>
<xml_diff>
--- a/BAO_CAO_KIEN_TRUC_VAN_HANH_CLOOP.docx
+++ b/BAO_CAO_KIEN_TRUC_VAN_HANH_CLOOP.docx
@@ -31,22 +31,9 @@
         </w:rPr>
         <w:t>Tài liệu Kỹ thuật, Luận giải Kiến trúc, Digital Damage Protocol, 4 Lớp Phòng Tuyến Fast-Track,</w:t>
         <w:br/>
-        <w:t>Cơ Chế Bảo Lãnh Cọc Bảo Toàn Vốn, Circuit Breaker &amp; Báo Cáo Thẩm Định Sẵn Sàng Triển Khai Techfest</w:t>
+        <w:t>Khung Chính Sách Bảo Đảm Giao Dịch Dự Kiến, Circuit Breaker &amp; Báo Cáo Thẩm Định Sẵn Sàng Triển Khai Techfest</w:t>
         <w:br/>
-        <w:t>Phiên bản 5.1 Production Hardened • Cập nhật: Tháng 09/2026 • Trạng thái: Live Production (cloop-sable.vercel.app)</w:t>
-      </w:r>
-    </w:p>
-    <w:p>
-      <w:pPr>
-        <w:spacing w:after="80"/>
-        <w:jc w:val="both"/>
-      </w:pPr>
-      <w:r>
-        <w:rPr>
-          <w:rFonts w:ascii="Times New Roman" w:hAnsi="Times New Roman"/>
-          <w:sz w:val="25"/>
-        </w:rPr>
-        <w:t>Tài liệu này trình bày chi tiết toàn bộ kiến trúc hạ tầng công nghệ thời gian thực, mô hình điều phối thanh toán (Payment Orchestration Layer), quy chuẩn xử lý hư hỏng (Digital Damage Protocol), giải mã 4 Tử huyệt ngành cho thuê thời trang, bộ đối thoại 7 câu hỏi tử thần của Quỹ đầu tư mạo hiểm (VC), hệ thống CLOOP Trust Stack bảo toàn vốn sàn (Fund-Capacity Constrained Guarantee), trần rủi ro tài sản (Transaction Exposure Limit), 4 lớp phòng tuyến bảo vệ Fast-Track, cơ chế ngắt mạch Circuit Breaker, mô hình phân tích điểm hòa vốn 3 kịch bản, bảo chứng an ninh kho lưu trữ GCS Fail-Closed và kết quả kiểm thử tự động 45/45 của nền tảng CLOOP. Tài liệu áp dụng phương pháp luận Đánh giá Kiến trúc và Đánh đổi Chiến lược 5 Tầng, tuân thủ nghiêm ngặt Luật Bảo vệ Dữ liệu Cá nhân số 91/2025/QH15, Nghị định 356/2025/NĐ-CP và Nghị định 52/2024/NĐ-CP về thanh toán không dùng tiền mặt.</w:t>
+        <w:t>Phiên bản 5.2 (MVP / Pilot) • Cập nhật: Tháng 09/2026 • Trạng thái: MVP/Pilot deployment phục vụ trình diễn Techfest (cloop-sable.vercel.app)</w:t>
       </w:r>
     </w:p>
     <w:tbl>
@@ -88,7 +75,7 @@
                 <w:color w:val="0F4A34"/>
                 <w:sz w:val="24"/>
               </w:rPr>
-              <w:t xml:space="preserve">CAM KẾT CHẤT LƯỢNG SẢN PHẨM SỐ &amp; TUYÊN BỐ NGUỒN VỐN BẢO CHỨNG: </w:t>
+              <w:t xml:space="preserve">TUYÊN BỐ MIỄN TRÁCH &amp; TÌNH TRẠNG PHÁP NHÂN (LEGAL &amp; ENTITY DISCLAIMER): </w:t>
             </w:r>
             <w:r>
               <w:rPr>
@@ -96,7 +83,78 @@
                 <w:i/>
                 <w:sz w:val="23"/>
               </w:rPr>
-              <w:t>Bản báo cáo v5.2 tích hợp toàn bộ các kết quả kiểm định mã nguồn thực tế tại commit mới nhất trên nhánh chính (origin/main). Hệ thống đạt 0 lỗi TypeScript (npx tsc --noEmit), 0 lỗi ESLint, vượt qua 57/57 bài kiểm thử tự động (43 Unit Tests + 14 Integration Tests). NGUYÊN TẮC VÀNG BẢO TOÀN NGUỒN VỐN: 'CLOOP không cam kết bảo lãnh vô hạn. Quyền giảm cọc chỉ được kích hoạt trong phạm vi quỹ dự phòng khả dụng, hạn mức bảo lãnh từng đơn, hạn mức rủi ro từng tài khoản và hạn mức chi trả theo tháng. Khi một trong các giới hạn bị chạm, hệ thống tự động quay về mức cọc 100%.' Đồng thời, bãi bỏ hoàn toàn các giả định phi thực tế về miễn cọc 0 đồng và xóa bỏ triệt để các biểu tượng trang trí lấp lánh để chuyển hóa 100% giao diện sang chuẩn mực số hóa cao cấp của Fintech/E-Commerce.</w:t>
+              <w:t>CLOOP hiện ở giai đoạn MVP/Pilot. Các cơ chế thanh toán, bảo đảm cọc, xử lý tranh chấp và lưu trữ dữ liệu là thiết kế kỹ thuật/kinh doanh dự kiến, chưa thay thế tư vấn pháp lý và chỉ nên vận hành thương mại sau khi hoàn tất pháp nhân, điều khoản dịch vụ, chính sách riêng tư và quy trình kế toán/thuế.</w:t>
+            </w:r>
+          </w:p>
+        </w:tc>
+      </w:tr>
+    </w:tbl>
+    <w:p>
+      <w:pPr>
+        <w:spacing w:before="40" w:after="40"/>
+      </w:pPr>
+    </w:p>
+    <w:p>
+      <w:pPr>
+        <w:spacing w:after="80"/>
+        <w:jc w:val="both"/>
+      </w:pPr>
+      <w:r>
+        <w:rPr>
+          <w:rFonts w:ascii="Times New Roman" w:hAnsi="Times New Roman"/>
+          <w:sz w:val="25"/>
+        </w:rPr>
+        <w:t>Tài liệu này trình bày chi tiết toàn bộ kiến trúc hạ tầng công nghệ thời gian thực, mô hình điều phối thanh toán (Payment Orchestration Layer), quy chuẩn xử lý hư hỏng (Digital Damage Protocol), giải mã 4 Tử huyệt ngành cho thuê thời trang, bộ đối thoại 7 câu hỏi chất vấn của Quỹ đầu tư mạo hiểm (VC), hệ thống CLOOP Trust Stack bảo toàn vốn sàn (Fund-Capacity Constrained Guarantee), trần rủi ro tài sản (Transaction Exposure Limit), 4 lớp phòng tuyến bảo vệ Fast-Track, cơ chế ngắt mạch Circuit Breaker, mô hình phân tích điểm hòa vốn 3 kịch bản, bảo chứng kỹ thuật kho lưu trữ GCS Fail-Closed và kết quả kiểm thử tự động của nền tảng CLOOP. Tài liệu áp dụng phương pháp luận Đánh giá Kiến trúc và Đánh đổi Chiến lược 5 Tầng, thiết kế theo hướng tuân thủ các nguyên tắc bảo vệ dữ liệu cá nhân (tham chiếu Luật số 91/2025/QH15, Nghị định 356/2025/NĐ-CP) và thanh toán không dùng tiền mặt (Nghị định 52/2024/NĐ-CP); cần rà soát pháp lý trước khi vận hành chính thức.</w:t>
+      </w:r>
+    </w:p>
+    <w:tbl>
+      <w:tblPr>
+        <w:tblW w:type="auto" w:w="0"/>
+        <w:jc w:val="center"/>
+        <w:tblLook w:firstColumn="1" w:firstRow="1" w:lastColumn="0" w:lastRow="0" w:noHBand="0" w:noVBand="1" w:val="04A0"/>
+      </w:tblPr>
+      <w:tblGrid>
+        <w:gridCol w:w="9071"/>
+      </w:tblGrid>
+      <w:tr>
+        <w:tc>
+          <w:tcPr>
+            <w:tcW w:type="dxa" w:w="9071"/>
+            <w:shd w:fill="F4F9F4"/>
+            <w:tcMar>
+              <w:top w:w="140" w:type="dxa"/>
+              <w:bottom w:w="140" w:type="dxa"/>
+              <w:left w:w="180" w:type="dxa"/>
+              <w:right w:w="160" w:type="dxa"/>
+            </w:tcMar>
+            <w:tcBorders>
+              <w:top w:val="none"/>
+              <w:bottom w:val="none"/>
+              <w:left w:val="single" w:sz="24" w:space="0" w:color="0F4A34"/>
+              <w:right w:val="none"/>
+            </w:tcBorders>
+          </w:tcPr>
+          <w:p>
+            <w:pPr>
+              <w:spacing w:after="40"/>
+              <w:jc w:val="both"/>
+            </w:pPr>
+            <w:r>
+              <w:rPr>
+                <w:rFonts w:ascii="Times New Roman" w:hAnsi="Times New Roman"/>
+                <w:b/>
+                <w:color w:val="0F4A34"/>
+                <w:sz w:val="24"/>
+              </w:rPr>
+              <w:t xml:space="preserve">CAM KẾT CHẤT LƯỢNG KỸ THUẬT &amp; QUY TẮC VÀNG VỀ NGUỒN VỐN: </w:t>
+            </w:r>
+            <w:r>
+              <w:rPr>
+                <w:rFonts w:ascii="Times New Roman" w:hAnsi="Times New Roman"/>
+                <w:i/>
+                <w:sz w:val="23"/>
+              </w:rPr>
+              <w:t>Bản báo cáo v5.2 tích hợp toàn bộ các kết quả kiểm định mã nguồn thực tế tại commit mới nhất trên nhánh chính (origin/main). Hệ thống đạt 0 lỗi TypeScript (npx tsc --noEmit), 0 lỗi ESLint. Kết quả kiểm thử môi trường cục bộ: 56/57 automated checks passed in the current local environment; 1 live database rollback test was skipped due to unavailable Supabase connection. Full production-readiness requires rerunning the suite against an active test database. NGUYÊN TẮC VÀNG BẢO TOÀN NGUỒN VỐN: 'CLOOP không cam kết bảo lãnh vô hạn. Quyền giảm cọc chỉ được kích hoạt trong phạm vi quỹ dự phòng khả dụng, hạn mức bảo lãnh từng đơn, hạn mức rủi ro từng tài khoản và hạn mức chi trả theo tháng. Khi một trong các giới hạn bị chạm, hệ thống tự động quay về mức cọc 100%.' Đồng thời, bãi bỏ hoàn toàn các giả định phi thực tế về miễn cọc 0 đồng và xóa bỏ triệt để các biểu tượng trang trí lấp lánh để chuyển hóa 100% giao diện sang chuẩn mực số hóa cao cấp của Fintech/E-Commerce.</w:t>
             </w:r>
           </w:p>
         </w:tc>
@@ -294,7 +352,7 @@
           <w:rFonts w:ascii="Times New Roman" w:hAnsi="Times New Roman"/>
           <w:sz w:val="25"/>
         </w:rPr>
-        <w:t>Mỗi giao dịch thuê phát sinh một mã QR động (VietQR NAPAS247 qua cổng PayOS) mã hóa chính xác số tiền cần thanh toán lẻ đến từng đồng và kèm mã định danh giao dịch độc nhất. CLOOP đóng vai trò là Lớp Điều Phối Trạng Thái Giao Dịch (Orchestration Layer), kết nối trực tiếp với Cổng Thanh Toán và Ngân Hàng đối tác để phong tỏa số tiền (Tiền thuê + Cọc đồ + Ship đi). Mọi Webhook gửi từ PayOS đều được kiểm tra chữ ký mật mã HMAC-SHA256 trên tập các cặp khóa-giá trị đã sắp xếp; đồng thời áp dụng câu lệnh cập nhật nguyên tử có điều kiện (Atomic Conditional Updates: where status = 'PENDING') để triệt tiêu hoàn toàn nguy cơ chi tiêu kép (Double-spend) hoặc Replay Attacks khi có nhiều worker xử lý đồng thời.</w:t>
+        <w:t>Mỗi giao dịch thuê phát sinh một mã QR động (VietQR NAPAS247 qua cổng PayOS) mã hóa chính xác số tiền cần thanh toán lẻ đến từng đồng và kèm mã định danh giao dịch độc nhất. CLOOP đóng vai trò là Lớp Điều Phối Trạng Thái Giao Dịch (Orchestration Layer), kết nối trực tiếp với Cổng Thanh Toán để thu và ghi nhận tiền cọc/tiền thuê qua mã QR động, đối soát bằng webhook. Mọi Webhook gửi từ PayOS đều được kiểm tra chữ ký mật mã HMAC-SHA256 trên tập các cặp khóa-giá trị đã sắp xếp; đồng thời áp dụng câu lệnh cập nhật nguyên tử có điều kiện (Atomic Conditional Updates: where status = 'PENDING') để triệt tiêu hoàn toàn nguy cơ chi tiêu kép (Double-spend) hoặc Replay Attacks khi có nhiều worker xử lý đồng thời.</w:t>
       </w:r>
     </w:p>
     <w:p>
@@ -316,7 +374,7 @@
           <w:rFonts w:ascii="Times New Roman" w:hAnsi="Times New Roman"/>
           <w:sz w:val="25"/>
         </w:rPr>
-        <w:t>Tạo niềm tin vững chắc cho cả hai phía: Khách thuê không sợ chủ tủ chiếm giữ tiền cọc bất hợp lý; Chủ tủ hoàn toàn an tâm gửi trang phục có giá trị cao vì toàn bộ giá trị đã được phong tỏa bảo chứng trong hệ thống thanh toán. Ngăn ngừa 100% rủi ro gian lận chỉnh sửa số tiền thanh toán.</w:t>
+        <w:t>Tạo niềm tin vững chắc cho cả hai phía: Khách thuê không sợ chủ tủ chiếm giữ tiền cọc bất hợp lý; Chủ tủ an tâm gửi trang phục vì toàn bộ tiền cọc và tiền thuê đã được ghi nhận và đối soát chính xác qua cổng thanh toán. Ngăn ngừa 100% rủi ro gian lận chỉnh sửa số tiền thanh toán.</w:t>
       </w:r>
     </w:p>
     <w:p>
@@ -419,7 +477,7 @@
           <w:rFonts w:ascii="Times New Roman" w:hAnsi="Times New Roman"/>
           <w:sz w:val="25"/>
         </w:rPr>
-        <w:t>Hệ thống sử dụng cơ chế Khóa bi quan ở cấp độ hàng (Row-Level Locking với câu lệnh SELECT ... FOR UPDATE) trong quá trình xử lý đơn hàng và lịch thuê. Toàn bộ các thao tác tài chính như cấn trừ cọc, giải ngân cho chủ tủ, xuất hóa đơn VAT và ghi nhận nhật ký kiểm toán (Audit Log) đều được đóng gói trong một Giao dịch cơ sở dữ liệu duy nhất ($transaction). Khi phát sinh bất kỳ lỗi runtime nào, toàn bộ giao dịch được Rollback ngay lập tức, đảm bảo không có dữ liệu tài chính mồ côi.</w:t>
+        <w:t>Hệ thống sử dụng cơ chế Khóa bi quan ở cấp độ hàng (Row-Level Locking với câu lệnh SELECT ... FOR UPDATE) trong quá trình xử lý đơn hàng và lịch thuê. Toàn bộ các thao tác tài chính như cấn trừ cọc, giải ngân cho chủ tủ, chuẩn bị cấu trúc dữ liệu kế toán để hỗ trợ xuất hóa đơn/chứng từ khi đơn vị vận hành đủ điều kiện pháp lý và ghi nhận nhật ký kiểm toán (Audit Log) đều được đóng gói trong một Giao dịch cơ sở dữ liệu duy nhất ($transaction). Khi phát sinh bất kỳ lỗi runtime nào, toàn bộ giao dịch được Rollback ngay lập tức, đảm bảo không có dữ liệu tài chính mồ côi.</w:t>
       </w:r>
     </w:p>
     <w:p>
@@ -838,7 +896,7 @@
           <w:rFonts w:ascii="Times New Roman" w:hAnsi="Times New Roman"/>
           <w:sz w:val="25"/>
         </w:rPr>
-        <w:t>Hạ tầng đạt chuẩn bảo mật doanh nghiệp quốc tế, độc lập hoàn toàn với cơ sở dữ liệu chính, đảm bảo tính toàn vẹn của bằng chứng pháp lý khi xảy ra khiếu nại.</w:t>
+        <w:t>Hạ tầng đạt chuẩn bảo mật doanh nghiệp quốc tế, độc lập hoàn toàn với cơ sở dữ liệu chính, đảm bảo tính toàn vẹn của bằng chứng đối soát kỹ thuật khi xảy ra khiếu nại.</w:t>
       </w:r>
     </w:p>
     <w:p>
@@ -1322,7 +1380,7 @@
           <w:rFonts w:ascii="Times New Roman" w:hAnsi="Times New Roman"/>
           <w:sz w:val="25"/>
         </w:rPr>
-        <w:t>Kẻ gian lập tài khoản ảo, sử dụng ảnh CCCD giả mạo từ internet hoặc giấy tờ sinh viên photoshop để thuê các món đồ thiết kế đắt tiền rồi 'bùng' chiếm đoạt tài sản. Nếu startup sinh viên bỏ hàng chục triệu mua API quét khuôn mặt eKYC của ngân hàng thì cạn kiệt ngân sách; nếu không eKYC thì thành 'mỏ vàng' cho kẻ gian.</w:t>
+        <w:t>Kẻ gian lập tài khoản ảo, sử dụng ảnh giấy tờ giả mạo để thuê các món đồ thiết kế đắt tiền rồi 'bùng' chiếm đoạt tài sản. Trong giai đoạn MVP tiền thương mại hóa, startup sinh viên chưa có ngân sách tích hợp API quét khuôn mặt eKYC chuyên dụng.</w:t>
       </w:r>
     </w:p>
     <w:p>
@@ -1344,7 +1402,7 @@
           <w:rFonts w:ascii="Times New Roman" w:hAnsi="Times New Roman"/>
           <w:sz w:val="25"/>
         </w:rPr>
-        <w:t>CLOOP xây dựng chiến lược 'Tạo rào cản ma sát thông minh' (Friction by Design) kết hợp 4 lớp phòng tuyến Fast-Track (Defense 0-3): Bắt buộc xác thực quyền sở hữu Email sinh viên (@edu.vn); Giới hạn trần tài sản đang giữ (Exposure Limit); Chặn đứng tài khoản đang có tranh chấp; và Áp trần Fast-Track tuyệt đối theo từng cấp độ tín nhiệm.</w:t>
+        <w:t>CLOOP xây dựng chiến lược 'Tạo rào cản ma sát thông minh' (Friction by Design) kết hợp 4 lớp phòng tuyến Fast-Track (Defense 0-3): Xác minh cơ bản qua email sinh viên (@edu.vn) hoặc số điện thoại OTP; Giới hạn trần tài sản đang giữ (Exposure Limit); Chặn đứng tài khoản đang có tranh chấp; và Áp trần Fast-Track tuyệt đối theo từng cấp độ tín nhiệm. eKYC/CCCD chuyên sâu là hạng mục Phase 3 sau khi hoàn thiện pháp nhân và chính sách dữ liệu nhạy cảm.</w:t>
       </w:r>
     </w:p>
     <w:p>
@@ -1366,7 +1424,7 @@
           <w:rFonts w:ascii="Times New Roman" w:hAnsi="Times New Roman"/>
           <w:sz w:val="25"/>
         </w:rPr>
-        <w:t>Chi phí eKYC bằng đúng 0 đồng nhưng chặn đứng 99% nỗ lực gian lận có tổ chức. Kẻ gian không thể dùng tài khoản nặc danh để bùng đơn hàng lớn.</w:t>
+        <w:t>Chặn đứng hầu hết các nỗ lực gian lận cơ bản bằng tài khoản nặc danh mà không tốn chi phí tích hợp eKYC nặng nề trong giai đoạn Pilot thử nghiệm.</w:t>
       </w:r>
     </w:p>
     <w:p>
@@ -1410,7 +1468,7 @@
           <w:rFonts w:ascii="Times New Roman" w:hAnsi="Times New Roman"/>
           <w:sz w:val="25"/>
         </w:rPr>
-        <w:t>Hỗ trợ kênh duyệt thủ công qua thẻ sinh viên vật lý hoặc video call cho các trường hợp sinh viên chưa được cấp email trường.</w:t>
+        <w:t>Giai đoạn Phase 3 sau khi có pháp nhân chính thức sẽ tích hợp nhà cung cấp eKYC có bản quyền (VNPT/FPT eKYC) để quét CCCD gắn chip và sinh trắc học khuôn mặt.</w:t>
       </w:r>
     </w:p>
     <w:p>
@@ -3962,7 +4020,7 @@
           <w:color w:val="0F4A34"/>
           <w:sz w:val="28"/>
         </w:rPr>
-        <w:t>VII. HỆ THỐNG 'CLOOP TRUST STACK' &amp; BẢO LÃNH CỌC BẢO TOÀN VỐN (PRODUCTION HARDENED)</w:t>
+        <w:t>VII. THIẾT KẾ KHUNG BẢO ĐẢM GIAO DỊCH DỰ KIẾN (CLOOP TRUST STACK - MVP/PILOT)</w:t>
       </w:r>
     </w:p>
     <w:p>
@@ -3975,7 +4033,7 @@
           <w:rFonts w:ascii="Times New Roman" w:hAnsi="Times New Roman"/>
           <w:sz w:val="25"/>
         </w:rPr>
-        <w:t>Thay vì áp dụng cơ chế eKYC nặng nề chặn cửa hoặc cấp ưu đãi giảm cọc vô điều kiện dẫn đến nguy cơ vỡ quỹ, CLOOP phát triển mô hình 'Hợp Đồng Bảo Lãnh Cọc Giới Hạn Năng Lực Quỹ' (Fund-Capacity Constrained Guarantee). Mọi quyền lợi giảm cọc đều được quản trị bởi điều kiện đa yếu tố, bảo chứng bằng số dư Quỹ dự phòng rủi ro khả dụng thực tế, hạn mức bảo lãnh từng đơn, hạn mức rủi ro từng tài khoản và có cơ chế ngắt mạch Circuit Breaker tự động.</w:t>
+        <w:t>CLOOP thiết kế cơ chế đề xuất giảm cọc có giới hạn, dự kiến vận hành qua quỹ dự phòng khi pháp nhân và điều khoản dịch vụ được hoàn thiện. Khung chính sách bảo đảm giao dịch dự kiến này cần được rà soát pháp lý trước khi triển khai thương mại. Mọi quyền lợi giảm cọc đều được quản trị bởi điều kiện đa yếu tố, bảo chứng bằng số dư Quỹ dự phòng rủi ro khả dụng thực tế, hạn mức bảo lãnh từng đơn, hạn mức rủi ro từng tài khoản và có cơ chế ngắt mạch Circuit Breaker tự động.</w:t>
       </w:r>
     </w:p>
     <w:tbl>
@@ -4017,7 +4075,7 @@
                 <w:color w:val="0F4A34"/>
                 <w:sz w:val="24"/>
               </w:rPr>
-              <w:t xml:space="preserve">TUYÊN BỐ NGUYÊN TẮC VÀNG BẢO TOÀN NGUỒN VỐN SÀN: </w:t>
+              <w:t xml:space="preserve">TUYÊN BỐ NGUYÊN TẮC VÀNG VỀ QUẢN TRỊ RỦI RO &amp; ĐỀ XUẤT GIẢM CỌC: </w:t>
             </w:r>
             <w:r>
               <w:rPr>
@@ -5076,7 +5134,7 @@
           <w:color w:val="183A2D"/>
           <w:sz w:val="26"/>
         </w:rPr>
-        <w:t>5. Giới Hạn Trách Nhiệm Pháp Lý Minh Bạch (Limit of Liability &amp; Valuation Cap)</w:t>
+        <w:t>5. Giới Hạn Trách Nhiệm Minh Bạch (Limit of Liability &amp; Valuation Cap)</w:t>
       </w:r>
     </w:p>
     <w:p>
@@ -5089,7 +5147,7 @@
           <w:rFonts w:ascii="Times New Roman" w:hAnsi="Times New Roman"/>
           <w:sz w:val="25"/>
         </w:rPr>
-        <w:t>CLOOP công bố công khai trần trách nhiệm pháp lý trong Điều khoản Dịch vụ Điện tử và giao diện trước khi thanh toán:</w:t>
+        <w:t>CLOOP công bố công khai trần trách nhiệm dịch vụ theo thỏa thuận người dùng và giao diện trước khi thanh toán:</w:t>
       </w:r>
     </w:p>
     <w:p>
@@ -5228,6 +5286,28 @@
           <w:sz w:val="25"/>
         </w:rPr>
         <w:t>Sau khi đăng nhập thành công, form tự động khôi phục trọn vẹn dữ liệu nháp để khách hoàn tất đăng đồ mà không phải nhập lại từ đầu.</w:t>
+      </w:r>
+    </w:p>
+    <w:p>
+      <w:pPr>
+        <w:pStyle w:val="ListBullet"/>
+        <w:spacing w:after="60"/>
+        <w:jc w:val="both"/>
+      </w:pPr>
+      <w:r>
+        <w:rPr>
+          <w:rFonts w:ascii="Times New Roman" w:hAnsi="Times New Roman"/>
+          <w:b/>
+          <w:sz w:val="25"/>
+        </w:rPr>
+        <w:t xml:space="preserve">• Bảo Vệ Dữ Liệu Phi Nhạy Cảm Phía Client: </w:t>
+      </w:r>
+      <w:r>
+        <w:rPr>
+          <w:rFonts w:ascii="Times New Roman" w:hAnsi="Times New Roman"/>
+          <w:sz w:val="25"/>
+        </w:rPr>
+        <w:t>Hệ thống chỉ lưu trữ bản nháp phi nhạy cảm ở phía client (tên món đồ, mô tả, mức giá dự kiến) trong sessionStorage. Dữ liệu định danh cá nhân, thông tin thanh toán và phiên làm việc (session token) tuyệt đối không lưu trong localStorage hay sessionStorage.</w:t>
       </w:r>
     </w:p>
     <w:p>
@@ -6028,7 +6108,7 @@
           <w:color w:val="0F4A34"/>
           <w:sz w:val="28"/>
         </w:rPr>
-        <w:t>VIII. KHUNG BẢO VỆ DỮ LIỆU CÁ NHÂN (LUẬT 91/2025/QH15 &amp; NĐ 356/2025/NĐ-CP)</w:t>
+        <w:t>VIII. KHUNG BẢO VỆ DỮ LIỆU CÁ NHÂN (ĐỊNH HƯỚNG THEO NGUYÊN TẮC LUẬT 91/2025/QH15)</w:t>
       </w:r>
     </w:p>
     <w:p>
@@ -6041,7 +6121,7 @@
           <w:rFonts w:ascii="Times New Roman" w:hAnsi="Times New Roman"/>
           <w:sz w:val="25"/>
         </w:rPr>
-        <w:t>CLOOP áp dụng triệt để nguyên lý 'Privacy by Design' và 'Collect less -&gt; Verify smarter' theo Luật Bảo vệ Dữ liệu Cá nhân số 91/2025/QH15 và Nghị định 356/2025/NĐ-CP (hiệu lực từ 01/01/2026):</w:t>
+        <w:t>CLOOP áp dụng triệt để nguyên lý 'Privacy by Design' và 'Collect less -&gt; Verify smarter', thiết kế theo hướng tuân thủ các nguyên tắc bảo vệ dữ liệu cá nhân (tham chiếu Luật số 91/2025/QH15 và Nghị định 356/2025/NĐ-CP); việc rà soát pháp lý đầy đủ sẽ được tiến hành trước khi vận hành chính thức:</w:t>
       </w:r>
     </w:p>
     <w:tbl>
@@ -6558,7 +6638,7 @@
                 <w:rFonts w:ascii="Times New Roman" w:hAnsi="Times New Roman"/>
                 <w:sz w:val="21"/>
               </w:rPr>
-              <w:t>Lưu trữ 5 năm theo Luật Kế toán Việt Nam</w:t>
+              <w:t>Lưu trữ 5 năm theo quy định kế toán</w:t>
             </w:r>
           </w:p>
         </w:tc>
@@ -6608,7 +6688,7 @@
                 <w:rFonts w:ascii="Times New Roman" w:hAnsi="Times New Roman"/>
                 <w:sz w:val="21"/>
               </w:rPr>
-              <w:t>Email trường @edu.vn, thông tin định danh</w:t>
+              <w:t>Email trường @edu.vn, thông tin định danh cơ bản</w:t>
             </w:r>
           </w:p>
         </w:tc>
@@ -6914,7 +6994,7 @@
           <w:color w:val="0F4A34"/>
           <w:sz w:val="28"/>
         </w:rPr>
-        <w:t>X. BÁO CÁO KIỂM THỬ TỰ ĐỘNG &amp; BẢO CHỨNG SẴN SÀNG TRIỂN KHAI (TEST SUITE)</w:t>
+        <w:t>X. BÁO CÁO KIỂM THỬ TỰ ĐỘNG &amp; BẢO CHỨNG KỸ THUẬT (TEST SUITE)</w:t>
       </w:r>
     </w:p>
     <w:p>
@@ -6927,7 +7007,7 @@
           <w:rFonts w:ascii="Times New Roman" w:hAnsi="Times New Roman"/>
           <w:sz w:val="25"/>
         </w:rPr>
-        <w:t>Hệ thống CLOOP được trang bị bộ kiểm thử tự động toàn diện hai lớp (Unit Tests &amp; Integration Tests) chạy trực tiếp trên mã nguồn TypeScript, đảm bảo mọi logic kinh tế học và an ninh đều được bảo chứng trước khi đưa vào sản xuất:</w:t>
+        <w:t>Hệ thống CLOOP được trang bị bộ kiểm thử tự động toàn diện hai lớp (Unit Tests &amp; Integration Tests) chạy trực tiếp trên mã nguồn TypeScript, đảm bảo mọi logic kinh tế học và an ninh đều được xác thực trước khi triển khai:</w:t>
       </w:r>
     </w:p>
     <w:tbl>
@@ -7657,14 +7737,14 @@
           <w:color w:val="111827"/>
           <w:sz w:val="25"/>
         </w:rPr>
-        <w:t xml:space="preserve">Bảo chứng Giao dịch &amp; An ninh Đám mây (14/14 Integration Tests PASSED): </w:t>
+        <w:t xml:space="preserve">Bảo chứng Giao dịch &amp; An ninh Đám mây (13/14 Integration Tests PASSED, 1 SKIPPED): </w:t>
       </w:r>
       <w:r>
         <w:rPr>
           <w:rFonts w:ascii="Times New Roman" w:hAnsi="Times New Roman"/>
           <w:sz w:val="25"/>
         </w:rPr>
-        <w:t>Bên cạnh 43 Unit Tests, bộ 14 Integration Tests (Fail-Closed &amp; Transactions) xác nhận tính toàn vẹn của hệ thống khi chạy thực tế (Tổng cộng: 57/57 bài kiểm thử PASSED 100%):</w:t>
+        <w:t>Kết quả kiểm thử môi trường cục bộ: 56/57 automated checks passed in the current local environment; 1 live database rollback test was skipped due to unavailable Supabase connection. Full production-readiness requires rerunning the suite against an active test database. Toàn bộ 43 Unit Tests và 13 Integration Tests độc lập đạt kết quả 100% PASS:</w:t>
       </w:r>
     </w:p>
     <w:p>
@@ -7686,7 +7766,7 @@
           <w:rFonts w:ascii="Times New Roman" w:hAnsi="Times New Roman"/>
           <w:sz w:val="25"/>
         </w:rPr>
-        <w:t>Đảm bảo hủy toàn bộ phiên giao dịch cơ sở dữ liệu nếu có lỗi, không sinh dữ liệu mồ côi.</w:t>
+        <w:t>Kiểm tra rollback toàn bộ giao dịch khi phát sinh lỗi runtime (13 passed, 1 skipped trong môi trường offline chưa kết nối PostgreSQL Supabase).</w:t>
       </w:r>
     </w:p>
     <w:p>
@@ -7752,7 +7832,7 @@
           <w:rFonts w:ascii="Times New Roman" w:hAnsi="Times New Roman"/>
           <w:sz w:val="25"/>
         </w:rPr>
-        <w:t>Xác thực chặn đứng tài khoản Level 0 chưa eKYC, chặn tài khoản đang có tranh chấp, chặn vượt quá 1 đơn đồng thời, chặn vượt trần tài sản.</w:t>
+        <w:t>Xác thực chặn đứng tài khoản Level 0 chưa xác minh, chặn tài khoản đang có tranh chấp, chặn vượt quá 1 đơn đồng thời, chặn vượt trần tài sản.</w:t>
       </w:r>
     </w:p>
     <w:p>
@@ -7802,7 +7882,7 @@
           <w:rFonts w:ascii="Times New Roman" w:hAnsi="Times New Roman"/>
           <w:sz w:val="25"/>
         </w:rPr>
-        <w:t>Để tránh bẫy 'Over-engineering' và đảm bảo tính khả thi thực tế của một Startup sinh viên, kiến trúc của CLOOP được phân kỳ rõ ràng:</w:t>
+        <w:t>Để tránh bẫy 'Over-engineering' và phù hợp với giai đoạn phát triển của dự án, kiến trúc của CLOOP được phân kỳ rõ ràng:</w:t>
       </w:r>
     </w:p>
     <w:p>
@@ -7817,14 +7897,14 @@
           <w:b/>
           <w:sz w:val="25"/>
         </w:rPr>
-        <w:t xml:space="preserve">1. PHASE 1: LIVE NOW (Phiên bản MVP Techfest): </w:t>
+        <w:t xml:space="preserve">1. PHASE 1: MVP / PILOT DEPLOYMENT (Phiên bản trình diễn Techfest): </w:t>
       </w:r>
       <w:r>
         <w:rPr>
           <w:rFonts w:ascii="Times New Roman" w:hAnsi="Times New Roman"/>
           <w:sz w:val="25"/>
         </w:rPr>
-        <w:t>Next.js + Supabase Auth (Email/Phone OTP) + VietQR PayOS Orchestration + Trust Score V1 (cọc 100% với user mới) + Upload video Before/After + Logistics GHN san sẻ ship 50/50 + Digital Damage Protocol (3 cấp độ) + Fast-Track 4 Phòng Tuyến + Cho phép khách vãng lai trải nghiệm đăng đồ. Chi phí eKYC: 0 đồng.</w:t>
+        <w:t>Next.js + Supabase Auth (Email/Phone OTP) + VietQR PayOS Orchestration + Trust Score V1 (cọc 100% với user mới) + Upload video Before/After + Logistics GHN san sẻ ship 50/50 + Digital Damage Protocol (3 cấp độ) + Fast-Track 4 Phòng Tuyến + Cho phép khách vãng lai trải nghiệm đăng đồ (chỉ lưu nháp phi nhạy cảm). Xác minh cơ bản qua email/số điện thoại.</w:t>
       </w:r>
     </w:p>
     <w:p>
@@ -7861,14 +7941,14 @@
           <w:b/>
           <w:sz w:val="25"/>
         </w:rPr>
-        <w:t xml:space="preserve">3. PHASE 3: SCALE-UP ARCHITECTURE (Giai đoạn gọi vốn VC 2029+): </w:t>
+        <w:t xml:space="preserve">3. PHASE 3: SCALE-UP ARCHITECTURE (Giai đoạn hoàn thiện pháp nhân và thương mại hóa): </w:t>
       </w:r>
       <w:r>
         <w:rPr>
           <w:rFonts w:ascii="Times New Roman" w:hAnsi="Times New Roman"/>
           <w:sz w:val="25"/>
         </w:rPr>
-        <w:t>Tích hợp đối tác eKYC chuyên dụng (Face match/Liveness) + AI Computer Vision tự động so khớp xước/bẩn + Multi-carrier failover (GHN/GHTK) + Cold storage R2/Google One.</w:t>
+        <w:t>Hoàn tất thủ tục pháp nhân, điều khoản dịch vụ và chính sách dữ liệu nhạy cảm + Tích hợp đối tác eKYC chuyên dụng (Face match/Liveness) + AI Computer Vision tự động so khớp xước/bẩn + Multi-carrier failover (GHN/GHTK) + Cold storage R2/Google One.</w:t>
       </w:r>
     </w:p>
     <w:p>
@@ -7884,7 +7964,7 @@
           <w:color w:val="0F4A34"/>
           <w:sz w:val="25"/>
         </w:rPr>
-        <w:t>KẾT LUẬN TOÀN DIỆN: Báo cáo v5.2 khẳng định CLOOP không né tránh rủi ro mà trực diện đối thoại và hóa giải 4 Tử huyệt lớn nhất của ngành kinh tế chia sẻ thời trang. Bằng sự kết hợp giữa Digital Damage Protocol, Lớp Điều Phối Thanh Toán VietQR, 4 Lớp Phòng Tuyến Fast-Track, Cơ chế Bảo lãnh Cọc Giới hạn Năng lực Quỹ &amp; Hạn Mức Từng Tài Khoản, Khung Bảo Vệ Dữ Liệu Cá Nhân Chuẩn Luật 91/2025/QH15, Bộ Kiểm Thử Tự Động 57/57 PASSED và Lộ trình phân kỳ 3 giai đoạn sắc bén, CLOOP chứng minh năng lực sẵn sàng bảo vệ thành công trước Hội Đồng Giám Khảo Techfest và tự tin tiến vào vòng gọi vốn hạt giống (Seed Round).</w:t>
+        <w:t>KẾT LUẬN TOÀN DIỆN: CLOOP hiện là MVP/Pilot. Các cơ chế giảm cọc, quỹ dự phòng và xử lý tranh chấp được thiết kế theo hướng kiểm soát rủi ro, nhưng chỉ triển khai thương mại chính thức sau khi hoàn tất pháp nhân, điều khoản dịch vụ, chính sách bảo vệ dữ liệu và quy trình kế toán/thuế. Về mặt kỹ thuật, hệ thống đạt 0 lỗi TypeScript, 0 lỗi ESLint, 56/57 automated checks passed trong môi trường cục bộ (1 test live database rollback được tạm skip do kết nối mạng), hoàn toàn sẵn sàng cho phiên trình diễn công nghệ và phản biện mô hình tại Techfest.</w:t>
       </w:r>
     </w:p>
     <w:sectPr>

</xml_diff>